<commit_message>
Revised builder (integrated it with prototype, facade and chain of responsibility)
</commit_message>
<xml_diff>
--- a/docs/Ash_Prac6_Research.docx
+++ b/docs/Ash_Prac6_Research.docx
@@ -101,6 +101,8 @@
         <w:t xml:space="preserve"> The workflow pauses to trigger a notification or API request to a designated authority, waiting for an external action (Approve or Reject) to finalize the state transition. </w:t>
       </w:r>
     </w:p>
+    <w:p/>
+    <w:p/>
     <w:p>
       <w:r>
         <w:t xml:space="preserve">This Intake and Approval Pipeline </w:t>
@@ -113,6 +115,59 @@
       <w:r>
         <w:t xml:space="preserve"> the core requirement of the TIVIDY system to operate as a generic workflow manager. By treating incoming information as abstract items and mapping attributes to generic variables, the engine can execute any process that follows a validation and approval lifecycle without requiring modifications to the core classes. The specific admissions scenario will serve only as a demonstration of the engine, rather than defining the engine's architecture. </w:t>
       </w:r>
+    </w:p>
+    <w:p>
+      <w:pPr>
+        <w:spacing w:before="100" w:beforeAutospacing="1" w:after="120"/>
+      </w:pPr>
+    </w:p>
+    <w:p>
+      <w:pPr>
+        <w:spacing w:before="100" w:beforeAutospacing="1" w:after="120"/>
+      </w:pPr>
+    </w:p>
+    <w:p>
+      <w:pPr>
+        <w:spacing w:before="100" w:beforeAutospacing="1" w:after="120"/>
+      </w:pPr>
+    </w:p>
+    <w:p>
+      <w:r>
+        <w:br w:type="page"/>
+      </w:r>
+    </w:p>
+    <w:p>
+      <w:pPr>
+        <w:rPr>
+          <w:u w:val="single"/>
+        </w:rPr>
+      </w:pPr>
+      <w:r>
+        <w:rPr>
+          <w:u w:val="single"/>
+        </w:rPr>
+        <w:lastRenderedPageBreak/>
+        <w:t>Builder Design Pattern (Integration with Chain of Responsibility</w:t>
+      </w:r>
+      <w:r>
+        <w:rPr>
+          <w:u w:val="single"/>
+        </w:rPr>
+        <w:t>, Facade</w:t>
+      </w:r>
+      <w:r>
+        <w:rPr>
+          <w:u w:val="single"/>
+        </w:rPr>
+        <w:t xml:space="preserve"> and Prototype)</w:t>
+      </w:r>
+    </w:p>
+    <w:p>
+      <w:pPr>
+        <w:rPr>
+          <w:u w:val="single"/>
+        </w:rPr>
+      </w:pPr>
     </w:p>
     <w:p>
       <w:pPr>
@@ -126,296 +181,599 @@
           <w:b/>
           <w:bCs/>
         </w:rPr>
-        <w:t>2. Design Pattern Integration</w:t>
-      </w:r>
-    </w:p>
-    <w:p>
-      <w:r>
-        <w:t xml:space="preserve">To </w:t>
-      </w:r>
-      <w:proofErr w:type="spellStart"/>
-      <w:r>
-        <w:t>fulfill</w:t>
-      </w:r>
-      <w:proofErr w:type="spellEnd"/>
-      <w:r>
-        <w:t xml:space="preserve"> the requirement of utilizing meaningful Gang of Four design patterns that solve genuine structural problems, the following patterns will drive the architecture of this specific pipeline: </w:t>
-      </w:r>
-    </w:p>
-    <w:p>
-      <w:pPr>
-        <w:numPr>
-          <w:ilvl w:val="0"/>
-          <w:numId w:val="2"/>
-        </w:numPr>
-      </w:pPr>
-      <w:r>
+        <w:t>1. The Strategy: One Director, Multiple Builders</w:t>
+      </w:r>
+    </w:p>
+    <w:p>
+      <w:r>
+        <w:t>Because every workflow must follow the exact same 3-step sequence (Ingest -&gt; Evaluate -&gt; Route), the system only requires a single Director. To create different types of workflows (like a Service Request vs. an Insurance Claim), the Client simply swaps out the Concrete Builders.</w:t>
+      </w:r>
+    </w:p>
+    <w:p>
+      <w:pPr>
+        <w:rPr>
+          <w:u w:val="single"/>
+        </w:rPr>
+      </w:pPr>
+    </w:p>
+    <w:p>
+      <w:pPr>
         <w:rPr>
           <w:b/>
           <w:bCs/>
         </w:rPr>
-        <w:t>Builder (Assigned Focus):</w:t>
-      </w:r>
-      <w:r>
-        <w:t xml:space="preserve"> A </w:t>
-      </w:r>
-      <w:proofErr w:type="spellStart"/>
-      <w:r>
-        <w:t>WorkflowBuilder</w:t>
-      </w:r>
-      <w:proofErr w:type="spellEnd"/>
-      <w:r>
-        <w:t xml:space="preserve"> will construct the complex </w:t>
-      </w:r>
-      <w:proofErr w:type="spellStart"/>
-      <w:r>
-        <w:t>WorkflowDefinition</w:t>
-      </w:r>
-      <w:proofErr w:type="spellEnd"/>
-      <w:r>
-        <w:t xml:space="preserve"> object. This strictly separates the static description of the process from the independent running instances, allowing for the step-by-step configuration of stages, evaluation rules, and participant assignments before an instance is instantiated. </w:t>
-      </w:r>
-    </w:p>
-    <w:p>
-      <w:pPr>
-        <w:numPr>
-          <w:ilvl w:val="0"/>
-          <w:numId w:val="2"/>
-        </w:numPr>
       </w:pPr>
       <w:r>
         <w:rPr>
           <w:b/>
           <w:bCs/>
         </w:rPr>
-        <w:t>Facade (Assigned Focus):</w:t>
-      </w:r>
-      <w:r>
-        <w:t xml:space="preserve"> A </w:t>
+        <w:t>2. The Roles &amp; Responsibilities</w:t>
+      </w:r>
+    </w:p>
+    <w:p>
+      <w:pPr>
+        <w:rPr>
+          <w:color w:val="215E99" w:themeColor="text2" w:themeTint="BF"/>
+        </w:rPr>
+      </w:pPr>
+      <w:r>
+        <w:rPr>
+          <w:color w:val="215E99" w:themeColor="text2" w:themeTint="BF"/>
+        </w:rPr>
+        <w:t>• The Director (</w:t>
       </w:r>
       <w:proofErr w:type="spellStart"/>
       <w:r>
-        <w:t>WorkflowEngineFacade</w:t>
+        <w:rPr>
+          <w:color w:val="215E99" w:themeColor="text2" w:themeTint="BF"/>
+        </w:rPr>
+        <w:t>WorkflowDirector</w:t>
       </w:r>
       <w:proofErr w:type="spellEnd"/>
       <w:r>
-        <w:t xml:space="preserve"> will provide a unified interface for the system's boundary layers. It will handle incoming data payloads during the Ingest phase and manage external API triggers during the Authorise phase. This completely shields external systems and UI components from the engine's complex internal state management and routing. </w:t>
-      </w:r>
-    </w:p>
-    <w:p>
-      <w:pPr>
-        <w:numPr>
-          <w:ilvl w:val="0"/>
-          <w:numId w:val="2"/>
-        </w:numPr>
-      </w:pPr>
-      <w:r>
+        <w:rPr>
+          <w:color w:val="215E99" w:themeColor="text2" w:themeTint="BF"/>
+        </w:rPr>
+        <w:t>)</w:t>
+      </w:r>
+    </w:p>
+    <w:p>
+      <w:r>
+        <w:t xml:space="preserve">  - Role: The manager of the sequence.</w:t>
+      </w:r>
+    </w:p>
+    <w:p>
+      <w:r>
+        <w:t xml:space="preserve">  - Logic: It knows nothing about nodes, rules, or the internal chain structure. It only enforces that a valid workflow must be built in three exact steps.</w:t>
+      </w:r>
+    </w:p>
+    <w:p>
+      <w:r>
+        <w:t xml:space="preserve">  - Action: Its construct() method blindly </w:t>
+      </w:r>
+      <w:proofErr w:type="gramStart"/>
+      <w:r>
+        <w:t>calls:</w:t>
+      </w:r>
+      <w:proofErr w:type="gramEnd"/>
+      <w:r>
+        <w:t xml:space="preserve"> builder-&gt;</w:t>
+      </w:r>
+      <w:proofErr w:type="spellStart"/>
+      <w:r>
+        <w:t>buildIngest</w:t>
+      </w:r>
+      <w:proofErr w:type="spellEnd"/>
+      <w:r>
+        <w:t>(), then builder-&gt;</w:t>
+      </w:r>
+      <w:proofErr w:type="spellStart"/>
+      <w:r>
+        <w:t>buildEvaluate</w:t>
+      </w:r>
+      <w:proofErr w:type="spellEnd"/>
+      <w:r>
+        <w:t>(), then builder-&gt;</w:t>
+      </w:r>
+      <w:proofErr w:type="spellStart"/>
+      <w:r>
+        <w:t>buildRoute</w:t>
+      </w:r>
+      <w:proofErr w:type="spellEnd"/>
+      <w:r>
+        <w:t>().</w:t>
+      </w:r>
+    </w:p>
+    <w:p>
+      <w:pPr>
+        <w:rPr>
+          <w:color w:val="215E99" w:themeColor="text2" w:themeTint="BF"/>
+        </w:rPr>
+      </w:pPr>
+    </w:p>
+    <w:p>
+      <w:pPr>
+        <w:rPr>
+          <w:color w:val="215E99" w:themeColor="text2" w:themeTint="BF"/>
+        </w:rPr>
+      </w:pPr>
+      <w:r>
+        <w:rPr>
+          <w:color w:val="215E99" w:themeColor="text2" w:themeTint="BF"/>
+        </w:rPr>
+        <w:t>• The Builder Interface (</w:t>
+      </w:r>
+      <w:proofErr w:type="spellStart"/>
+      <w:r>
+        <w:rPr>
+          <w:color w:val="215E99" w:themeColor="text2" w:themeTint="BF"/>
+        </w:rPr>
+        <w:t>ChainBuilder</w:t>
+      </w:r>
+      <w:proofErr w:type="spellEnd"/>
+      <w:r>
+        <w:rPr>
+          <w:color w:val="215E99" w:themeColor="text2" w:themeTint="BF"/>
+        </w:rPr>
+        <w:t>)</w:t>
+      </w:r>
+    </w:p>
+    <w:p>
+      <w:r>
+        <w:t xml:space="preserve">  - Role: The contract. It defines the abstract build...() methods and the </w:t>
+      </w:r>
+      <w:proofErr w:type="spellStart"/>
+      <w:r>
+        <w:t>getResult</w:t>
+      </w:r>
+      <w:proofErr w:type="spellEnd"/>
+      <w:r>
+        <w:t>() method that all concrete builders must implement.</w:t>
+      </w:r>
+    </w:p>
+    <w:p>
+      <w:pPr>
+        <w:rPr>
+          <w:color w:val="215E99" w:themeColor="text2" w:themeTint="BF"/>
+        </w:rPr>
+      </w:pPr>
+    </w:p>
+    <w:p>
+      <w:pPr>
+        <w:rPr>
+          <w:color w:val="215E99" w:themeColor="text2" w:themeTint="BF"/>
+        </w:rPr>
+      </w:pPr>
+      <w:r>
+        <w:rPr>
+          <w:color w:val="215E99" w:themeColor="text2" w:themeTint="BF"/>
+        </w:rPr>
+        <w:t xml:space="preserve">• The Concrete Builders (e.g., </w:t>
+      </w:r>
+      <w:proofErr w:type="spellStart"/>
+      <w:r>
+        <w:rPr>
+          <w:color w:val="215E99" w:themeColor="text2" w:themeTint="BF"/>
+        </w:rPr>
+        <w:t>ServiceRequestBuilder</w:t>
+      </w:r>
+      <w:proofErr w:type="spellEnd"/>
+      <w:r>
+        <w:rPr>
+          <w:color w:val="215E99" w:themeColor="text2" w:themeTint="BF"/>
+        </w:rPr>
+        <w:t>)</w:t>
+      </w:r>
+    </w:p>
+    <w:p>
+      <w:r>
+        <w:t xml:space="preserve">  - Role: The mechanic. This is where all the domain-specific logic and instantiation </w:t>
+      </w:r>
+      <w:proofErr w:type="gramStart"/>
+      <w:r>
+        <w:t>happens</w:t>
+      </w:r>
+      <w:proofErr w:type="gramEnd"/>
+      <w:r>
+        <w:t>.</w:t>
+      </w:r>
+    </w:p>
+    <w:p>
+      <w:r>
+        <w:t xml:space="preserve">  - Storage: It has a private member variable of type `Workflow*` (the Product wrapper) that acts as the canvas.</w:t>
+      </w:r>
+    </w:p>
+    <w:p>
+      <w:r>
+        <w:t xml:space="preserve">  - Action: When the Director tells it to </w:t>
+      </w:r>
+      <w:proofErr w:type="spellStart"/>
+      <w:r>
+        <w:t>buildEvaluate</w:t>
+      </w:r>
+      <w:proofErr w:type="spellEnd"/>
+      <w:r>
+        <w:t>(), this builder instantiates the specific Strategy and Composite nodes needed for a Service Request. It then calls `product-&gt;</w:t>
+      </w:r>
+      <w:proofErr w:type="spellStart"/>
+      <w:r>
+        <w:t>addHandler</w:t>
+      </w:r>
+      <w:proofErr w:type="spellEnd"/>
+      <w:r>
+        <w:t>(node)`, delegating the actual pointer linking to the Product itself.</w:t>
+      </w:r>
+    </w:p>
+    <w:p/>
+    <w:p/>
+    <w:p>
+      <w:pPr>
+        <w:rPr>
+          <w:color w:val="215E99" w:themeColor="text2" w:themeTint="BF"/>
+        </w:rPr>
+      </w:pPr>
+      <w:r>
+        <w:rPr>
+          <w:color w:val="215E99" w:themeColor="text2" w:themeTint="BF"/>
+        </w:rPr>
+        <w:lastRenderedPageBreak/>
+        <w:t>• The Product (Workflow)</w:t>
+      </w:r>
+    </w:p>
+    <w:p>
+      <w:r>
+        <w:t xml:space="preserve">  - Role: The encapsulated Chain of Responsibility.</w:t>
+      </w:r>
+    </w:p>
+    <w:p>
+      <w:r>
+        <w:t xml:space="preserve">  - Logic: Rather than returning a raw `Handler*` pointer, the system uses a `Workflow` class. This class holds the head of the Linked List and provides an `</w:t>
+      </w:r>
+      <w:proofErr w:type="spellStart"/>
+      <w:r>
+        <w:t>addHandler</w:t>
+      </w:r>
+      <w:proofErr w:type="spellEnd"/>
+      <w:r>
+        <w:t>(Handler*)` method, which safely manages the `this-&gt;</w:t>
+      </w:r>
+      <w:proofErr w:type="spellStart"/>
+      <w:r>
+        <w:t>lastNode</w:t>
+      </w:r>
+      <w:proofErr w:type="spellEnd"/>
+      <w:r>
+        <w:t>-&gt;</w:t>
+      </w:r>
+      <w:proofErr w:type="spellStart"/>
+      <w:r>
+        <w:t>setNext</w:t>
+      </w:r>
+      <w:proofErr w:type="spellEnd"/>
+      <w:r>
+        <w:t>()` pointer wiring internally.</w:t>
+      </w:r>
+    </w:p>
+    <w:p/>
+    <w:p>
+      <w:pPr>
+        <w:rPr>
+          <w:color w:val="215E99" w:themeColor="text2" w:themeTint="BF"/>
+        </w:rPr>
+      </w:pPr>
+      <w:r>
+        <w:rPr>
+          <w:color w:val="215E99" w:themeColor="text2" w:themeTint="BF"/>
+        </w:rPr>
+        <w:t>• The Client</w:t>
+      </w:r>
+    </w:p>
+    <w:p>
+      <w:r>
+        <w:t xml:space="preserve">  - Role: The initiator.</w:t>
+      </w:r>
+    </w:p>
+    <w:p>
+      <w:r>
+        <w:t xml:space="preserve">  - Action: The client instantiates a </w:t>
+      </w:r>
+      <w:proofErr w:type="spellStart"/>
+      <w:r>
+        <w:t>ServiceRequestBuilder</w:t>
+      </w:r>
+      <w:proofErr w:type="spellEnd"/>
+      <w:r>
+        <w:t xml:space="preserve"> and gives it to the </w:t>
+      </w:r>
+      <w:proofErr w:type="spellStart"/>
+      <w:r>
+        <w:t>WorkflowDirector</w:t>
+      </w:r>
+      <w:proofErr w:type="spellEnd"/>
+      <w:r>
+        <w:t xml:space="preserve">. It tells the Director to construct(). Once finished, the Client calls </w:t>
+      </w:r>
+      <w:proofErr w:type="spellStart"/>
+      <w:r>
+        <w:t>getResult</w:t>
+      </w:r>
+      <w:proofErr w:type="spellEnd"/>
+      <w:r>
+        <w:t>().</w:t>
+      </w:r>
+    </w:p>
+    <w:p>
+      <w:r>
+        <w:t xml:space="preserve">  - Outcome: The Client receives the fully assembled complex product (the `Workflow` object) without ever knowing how the individual Handler nodes were instantiated or linked together.</w:t>
+      </w:r>
+    </w:p>
+    <w:p>
+      <w:pPr>
         <w:rPr>
           <w:b/>
           <w:bCs/>
         </w:rPr>
-        <w:t>Strategy:</w:t>
-      </w:r>
-      <w:r>
-        <w:t xml:space="preserve"> This will be applied in the Evaluate &amp; Filter phase. By encapsulating different evaluation thresholds and routing rules into interchangeable strategy </w:t>
-      </w:r>
-      <w:r>
-        <w:lastRenderedPageBreak/>
-        <w:t xml:space="preserve">objects, the system avoids large centralized if/else chains and manual type checks. </w:t>
-      </w:r>
-    </w:p>
-    <w:p>
-      <w:pPr>
-        <w:numPr>
-          <w:ilvl w:val="0"/>
-          <w:numId w:val="2"/>
-        </w:numPr>
-      </w:pPr>
-      <w:r>
+      </w:pPr>
+    </w:p>
+    <w:p>
+      <w:pPr>
         <w:rPr>
           <w:b/>
           <w:bCs/>
         </w:rPr>
-        <w:t>State:</w:t>
-      </w:r>
-      <w:r>
-        <w:t xml:space="preserve"> This pattern will manage the lifecycle of individual work items. As running work changes over time (e.g., created, available, started, completed, rejected), the State pattern ensures operations are only executed if they are valid for the item's current phase in the Intake and Approval Pipeline. </w:t>
-      </w:r>
-    </w:p>
-    <w:p>
-      <w:pPr>
-        <w:numPr>
-          <w:ilvl w:val="0"/>
-          <w:numId w:val="2"/>
-        </w:numPr>
       </w:pPr>
       <w:r>
         <w:rPr>
           <w:b/>
           <w:bCs/>
         </w:rPr>
-        <w:t>Observer:</w:t>
-      </w:r>
-      <w:r>
-        <w:t xml:space="preserve"> During the Authorise &amp; Route phase, this pattern will handle external communication. When a work item changes state or triggers an event, multiple interested parts of the system or external monitors can react without tightly coupling the core workflow model to the notification mechanisms. </w:t>
-      </w:r>
-    </w:p>
-    <w:p>
-      <w:pPr>
+        <w:t>3. Runtime Execution &amp; Prototype Integration</w:t>
+      </w:r>
+    </w:p>
+    <w:p>
+      <w:r>
+        <w:t>To avoid the overhead of rebuilding a complex object graph for every single request, the system integrates the Prototype pattern:</w:t>
+      </w:r>
+    </w:p>
+    <w:p>
+      <w:r>
+        <w:t xml:space="preserve">  - Startup Phase: Upon system boot, the Builder constructs a static "Master Template" of a workflow (e.g., a master Service Request `Workflow` object).</w:t>
+      </w:r>
+    </w:p>
+    <w:p>
+      <w:r>
+        <w:t xml:space="preserve">  </w:t>
+      </w:r>
+      <w:r>
         <w:rPr>
           <w:b/>
           <w:bCs/>
         </w:rPr>
-      </w:pPr>
+        <w:t>- Prototype Usage</w:t>
+      </w:r>
+      <w:r>
+        <w:t xml:space="preserve">: This master `Workflow` acts as a Prototype. </w:t>
+      </w:r>
+    </w:p>
+    <w:p>
+      <w:r>
+        <w:t xml:space="preserve">  - Execution Phase: When a new data payload arrives at the </w:t>
+      </w:r>
       <w:r>
         <w:rPr>
           <w:b/>
           <w:bCs/>
         </w:rPr>
-        <w:t>3. Execution Plan for Practical 6</w:t>
-      </w:r>
-    </w:p>
-    <w:p>
-      <w:r>
-        <w:t xml:space="preserve">Because Practical 6 focuses on research and design without requiring a complete C++11 implementation, the immediate execution plan </w:t>
-      </w:r>
-      <w:proofErr w:type="spellStart"/>
-      <w:r>
-        <w:t>centers</w:t>
-      </w:r>
-      <w:proofErr w:type="spellEnd"/>
-      <w:r>
-        <w:t xml:space="preserve"> on translating this generic pipeline into rigorous UML models: </w:t>
-      </w:r>
-    </w:p>
-    <w:p>
-      <w:pPr>
-        <w:numPr>
-          <w:ilvl w:val="0"/>
-          <w:numId w:val="3"/>
-        </w:numPr>
-      </w:pPr>
-      <w:r>
+        <w:t>Facade</w:t>
+      </w:r>
+      <w:r>
+        <w:t>, the system simply calls `clone()` on the master `Workflow`. This performs a deep copy of the underlying Handler chain, providing a fresh, independent running instance of the pipeline for that specific request payload.</w:t>
+      </w:r>
+    </w:p>
+    <w:p>
+      <w:pPr>
+        <w:rPr>
+          <w:u w:val="single"/>
+        </w:rPr>
+      </w:pPr>
+    </w:p>
+    <w:p>
+      <w:pPr>
+        <w:rPr>
+          <w:u w:val="single"/>
+        </w:rPr>
+      </w:pPr>
+    </w:p>
+    <w:p>
+      <w:pPr>
+        <w:rPr>
+          <w:u w:val="single"/>
+        </w:rPr>
+      </w:pPr>
+    </w:p>
+    <w:p>
+      <w:pPr>
+        <w:rPr>
+          <w:u w:val="single"/>
+        </w:rPr>
+      </w:pPr>
+    </w:p>
+    <w:p>
+      <w:pPr>
+        <w:rPr>
+          <w:u w:val="single"/>
+        </w:rPr>
+      </w:pPr>
+    </w:p>
+    <w:p>
+      <w:pPr>
+        <w:rPr>
+          <w:u w:val="single"/>
+        </w:rPr>
+      </w:pPr>
+    </w:p>
+    <w:p>
+      <w:pPr>
         <w:rPr>
           <w:b/>
           <w:bCs/>
-        </w:rPr>
-        <w:t>Activity Diagrams:</w:t>
-      </w:r>
-      <w:r>
-        <w:t xml:space="preserve"> Model the generic three-step Intake and Approval execution pipeline, ensuring actions, decisions, and </w:t>
-      </w:r>
-      <w:proofErr w:type="spellStart"/>
-      <w:r>
-        <w:t>swimlanes</w:t>
-      </w:r>
-      <w:proofErr w:type="spellEnd"/>
-      <w:r>
-        <w:t xml:space="preserve"> accurately reflect the abstract data flow from ingestion to final routing. </w:t>
-      </w:r>
-    </w:p>
-    <w:p>
-      <w:pPr>
-        <w:numPr>
-          <w:ilvl w:val="0"/>
-          <w:numId w:val="3"/>
-        </w:numPr>
+          <w:u w:val="single"/>
+        </w:rPr>
       </w:pPr>
       <w:r>
         <w:rPr>
           <w:b/>
           <w:bCs/>
-        </w:rPr>
-        <w:t>Class Diagram:</w:t>
-      </w:r>
-      <w:r>
-        <w:t xml:space="preserve"> Map the Builder, Facade, Strategy, State, and Observer participants to the TIVIDY class structure. Clear visual notation will be used to highlight these pattern collaborations across the subsystems. </w:t>
-      </w:r>
-    </w:p>
-    <w:p>
-      <w:pPr>
-        <w:numPr>
-          <w:ilvl w:val="0"/>
-          <w:numId w:val="3"/>
-        </w:numPr>
-      </w:pPr>
-      <w:r>
+          <w:u w:val="single"/>
+        </w:rPr>
+        <w:lastRenderedPageBreak/>
+        <w:t>Example of how the complex object will be built ( It is a linked list of Handlers)</w:t>
+      </w:r>
+    </w:p>
+    <w:p>
+      <w:pPr>
         <w:rPr>
           <w:b/>
           <w:bCs/>
         </w:rPr>
-        <w:t>Runtime Behaviour Diagrams:</w:t>
-      </w:r>
-      <w:r>
-        <w:t xml:space="preserve"> Develop Sequence Diagrams showcasing the interactions during the Ingest and Authorise phases, and a State Diagram detailing the lifecycle and valid transitions of a generic work item. </w:t>
-      </w:r>
-    </w:p>
-    <w:p>
-      <w:pPr>
-        <w:numPr>
-          <w:ilvl w:val="0"/>
-          <w:numId w:val="3"/>
-        </w:numPr>
-      </w:pPr>
-      <w:r>
+      </w:pPr>
+    </w:p>
+    <w:p>
+      <w:pPr>
         <w:rPr>
           <w:b/>
           <w:bCs/>
-        </w:rPr>
-        <w:t>Documentation and Repository Management:</w:t>
-      </w:r>
-      <w:r>
-        <w:t xml:space="preserve"> Record these specific architectural choices, pattern justifications, and the refinement into the generic Intake and Approval Pipeline in the project's design history. All diagrams, research, and design decisions will be committed to the team's GitHub repository. </w:t>
-      </w:r>
-    </w:p>
-    <w:p>
-      <w:pPr>
-        <w:spacing w:before="100" w:beforeAutospacing="1" w:after="120"/>
-      </w:pPr>
-    </w:p>
-    <w:p>
-      <w:pPr>
-        <w:spacing w:before="100" w:beforeAutospacing="1" w:after="120"/>
-      </w:pPr>
-    </w:p>
-    <w:p>
-      <w:pPr>
-        <w:spacing w:before="100" w:beforeAutospacing="1" w:after="120"/>
-      </w:pPr>
-    </w:p>
-    <w:p>
-      <w:pPr>
-        <w:spacing w:before="100" w:beforeAutospacing="1" w:after="120"/>
-      </w:pPr>
-    </w:p>
-    <w:p>
-      <w:pPr>
-        <w:spacing w:before="100" w:beforeAutospacing="1" w:after="120"/>
+          <w:u w:val="single"/>
+        </w:rPr>
+      </w:pPr>
+      <w:r>
         <w:rPr>
           <w:b/>
           <w:bCs/>
-          <w:sz w:val="32"/>
-          <w:szCs w:val="32"/>
+          <w:u w:val="single"/>
+        </w:rPr>
+        <w:drawing>
+          <wp:inline distT="0" distB="0" distL="0" distR="0" wp14:anchorId="4694CB61" wp14:editId="05E14749">
+            <wp:extent cx="5233784" cy="4464685"/>
+            <wp:effectExtent l="0" t="0" r="5080" b="0"/>
+            <wp:docPr id="1778374604" name="Picture 1"/>
+            <wp:cNvGraphicFramePr>
+              <a:graphicFrameLocks xmlns:a="http://schemas.openxmlformats.org/drawingml/2006/main" noChangeAspect="1"/>
+            </wp:cNvGraphicFramePr>
+            <a:graphic xmlns:a="http://schemas.openxmlformats.org/drawingml/2006/main">
+              <a:graphicData uri="http://schemas.openxmlformats.org/drawingml/2006/picture">
+                <pic:pic xmlns:pic="http://schemas.openxmlformats.org/drawingml/2006/picture">
+                  <pic:nvPicPr>
+                    <pic:cNvPr id="1778374604" name="Picture 1"/>
+                    <pic:cNvPicPr/>
+                  </pic:nvPicPr>
+                  <pic:blipFill>
+                    <a:blip r:embed="rId5">
+                      <a:extLst>
+                        <a:ext uri="{28A0092B-C50C-407E-A947-70E740481C1C}">
+                          <a14:useLocalDpi xmlns:a14="http://schemas.microsoft.com/office/drawing/2010/main" val="0"/>
+                        </a:ext>
+                      </a:extLst>
+                    </a:blip>
+                    <a:stretch>
+                      <a:fillRect/>
+                    </a:stretch>
+                  </pic:blipFill>
+                  <pic:spPr>
+                    <a:xfrm>
+                      <a:off x="0" y="0"/>
+                      <a:ext cx="5233784" cy="4464685"/>
+                    </a:xfrm>
+                    <a:prstGeom prst="rect">
+                      <a:avLst/>
+                    </a:prstGeom>
+                  </pic:spPr>
+                </pic:pic>
+              </a:graphicData>
+            </a:graphic>
+          </wp:inline>
+        </w:drawing>
+      </w:r>
+    </w:p>
+    <w:p>
+      <w:pPr>
+        <w:rPr>
+          <w:b/>
+          <w:bCs/>
+          <w:u w:val="single"/>
+        </w:rPr>
+      </w:pPr>
+    </w:p>
+    <w:p>
+      <w:pPr>
+        <w:rPr>
+          <w:b/>
+          <w:bCs/>
+          <w:u w:val="single"/>
+        </w:rPr>
+      </w:pPr>
+    </w:p>
+    <w:p>
+      <w:pPr>
+        <w:rPr>
+          <w:b/>
+          <w:bCs/>
+          <w:u w:val="single"/>
+        </w:rPr>
+      </w:pPr>
+    </w:p>
+    <w:p>
+      <w:pPr>
+        <w:rPr>
+          <w:b/>
+          <w:bCs/>
+          <w:u w:val="single"/>
+        </w:rPr>
+      </w:pPr>
+    </w:p>
+    <w:p>
+      <w:pPr>
+        <w:rPr>
+          <w:b/>
+          <w:bCs/>
+          <w:u w:val="single"/>
         </w:rPr>
       </w:pPr>
     </w:p>
     <w:p>
       <w:pPr>
         <w:spacing w:before="100" w:beforeAutospacing="1" w:after="120"/>
+      </w:pPr>
+    </w:p>
+    <w:p>
+      <w:pPr>
+        <w:spacing w:before="100" w:beforeAutospacing="1" w:after="120"/>
+      </w:pPr>
+    </w:p>
+    <w:p>
+      <w:pPr>
+        <w:spacing w:before="100" w:beforeAutospacing="1" w:after="120"/>
+      </w:pPr>
+    </w:p>
+    <w:p>
+      <w:pPr>
+        <w:spacing w:before="100" w:beforeAutospacing="1" w:after="120"/>
+      </w:pPr>
+    </w:p>
+    <w:p>
+      <w:pPr>
+        <w:spacing w:before="100" w:beforeAutospacing="1" w:after="120"/>
+      </w:pPr>
+    </w:p>
+    <w:p>
+      <w:r>
         <w:rPr>
           <w:b/>
           <w:bCs/>
           <w:sz w:val="28"/>
           <w:szCs w:val="28"/>
         </w:rPr>
-      </w:pPr>
-      <w:r>
-        <w:rPr>
-          <w:b/>
-          <w:bCs/>
-          <w:sz w:val="28"/>
-          <w:szCs w:val="28"/>
-        </w:rPr>
         <w:lastRenderedPageBreak/>
         <w:t>Examples of scenarios where this type of pipeline is used:</w:t>
       </w:r>
@@ -487,6 +845,9 @@
     <w:p>
       <w:pPr>
         <w:ind w:left="360"/>
+        <w:rPr>
+          <w:u w:val="single"/>
+        </w:rPr>
       </w:pPr>
       <w:r>
         <w:rPr>
@@ -505,6 +866,7 @@
         <w:rPr>
           <w:b/>
           <w:bCs/>
+          <w:u w:val="single"/>
         </w:rPr>
         <w:t>Kognitos</w:t>
       </w:r>
@@ -513,16 +875,21 @@
         <w:rPr>
           <w:b/>
           <w:bCs/>
+          <w:u w:val="single"/>
         </w:rPr>
         <w:t>.</w:t>
       </w:r>
       <w:r>
+        <w:rPr>
+          <w:u w:val="single"/>
+        </w:rPr>
         <w:t xml:space="preserve"> (2026). </w:t>
       </w:r>
       <w:r>
         <w:rPr>
           <w:i/>
           <w:iCs/>
+          <w:u w:val="single"/>
         </w:rPr>
         <w:t>What Is Insurance Claims Automation? A Complete Guide.</w:t>
       </w:r>
@@ -533,18 +900,25 @@
           <w:ilvl w:val="0"/>
           <w:numId w:val="7"/>
         </w:numPr>
+        <w:rPr>
+          <w:u w:val="single"/>
+        </w:rPr>
       </w:pPr>
       <w:r>
         <w:rPr>
           <w:b/>
           <w:bCs/>
+          <w:u w:val="single"/>
         </w:rPr>
         <w:t>URL:</w:t>
       </w:r>
       <w:r>
+        <w:rPr>
+          <w:u w:val="single"/>
+        </w:rPr>
         <w:t xml:space="preserve"> </w:t>
       </w:r>
-      <w:hyperlink r:id="rId5" w:tgtFrame="_blank" w:history="1">
+      <w:hyperlink r:id="rId6" w:tgtFrame="_blank" w:history="1">
         <w:r>
           <w:rPr>
             <w:rStyle w:val="Hyperlink"/>
@@ -559,36 +933,51 @@
           <w:ilvl w:val="0"/>
           <w:numId w:val="7"/>
         </w:numPr>
+        <w:rPr>
+          <w:u w:val="single"/>
+        </w:rPr>
       </w:pPr>
       <w:r>
         <w:rPr>
           <w:b/>
           <w:bCs/>
+          <w:u w:val="single"/>
         </w:rPr>
         <w:t>Relevance:</w:t>
       </w:r>
       <w:r>
+        <w:rPr>
+          <w:u w:val="single"/>
+        </w:rPr>
         <w:t xml:space="preserve"> Details the exact intake-to-settlement lifecycle using automated triage, data validation, and routing exceptions to human adjusters.</w:t>
       </w:r>
     </w:p>
     <w:p>
       <w:pPr>
         <w:ind w:left="360"/>
+        <w:rPr>
+          <w:u w:val="single"/>
+        </w:rPr>
       </w:pPr>
       <w:r>
         <w:rPr>
           <w:b/>
           <w:bCs/>
+          <w:u w:val="single"/>
         </w:rPr>
         <w:t>Assured.</w:t>
       </w:r>
       <w:r>
+        <w:rPr>
+          <w:u w:val="single"/>
+        </w:rPr>
         <w:t xml:space="preserve"> (2026). </w:t>
       </w:r>
       <w:r>
         <w:rPr>
           <w:i/>
           <w:iCs/>
+          <w:u w:val="single"/>
         </w:rPr>
         <w:t>Straight-Through Processing in Insurance Claims.</w:t>
       </w:r>
@@ -599,18 +988,25 @@
           <w:ilvl w:val="0"/>
           <w:numId w:val="8"/>
         </w:numPr>
+        <w:rPr>
+          <w:u w:val="single"/>
+        </w:rPr>
       </w:pPr>
       <w:r>
         <w:rPr>
           <w:b/>
           <w:bCs/>
+          <w:u w:val="single"/>
         </w:rPr>
         <w:t>URL:</w:t>
       </w:r>
       <w:r>
+        <w:rPr>
+          <w:u w:val="single"/>
+        </w:rPr>
         <w:t xml:space="preserve"> </w:t>
       </w:r>
-      <w:hyperlink r:id="rId6" w:tgtFrame="_blank" w:history="1">
+      <w:hyperlink r:id="rId7" w:tgtFrame="_blank" w:history="1">
         <w:r>
           <w:rPr>
             <w:rStyle w:val="Hyperlink"/>
@@ -625,34 +1021,23 @@
           <w:ilvl w:val="0"/>
           <w:numId w:val="8"/>
         </w:numPr>
+        <w:rPr>
+          <w:u w:val="single"/>
+        </w:rPr>
       </w:pPr>
       <w:r>
         <w:rPr>
           <w:b/>
           <w:bCs/>
+          <w:u w:val="single"/>
         </w:rPr>
         <w:t>Relevance:</w:t>
       </w:r>
       <w:r>
-        <w:t xml:space="preserve"> Outlines the structured pipeline of Intake &amp; Data Capture </w:t>
-      </w:r>
-      <w:r>
-        <w:t>~&gt;</w:t>
-      </w:r>
-      <w:r>
-        <w:t xml:space="preserve"> Policy Verification </w:t>
-      </w:r>
-      <w:r>
-        <w:t>~&gt;</w:t>
-      </w:r>
-      <w:r>
-        <w:t xml:space="preserve"> Fraud Scoring </w:t>
-      </w:r>
-      <w:r>
-        <w:t>~&gt;</w:t>
-      </w:r>
-      <w:r>
-        <w:t xml:space="preserve"> Automated Triage.</w:t>
+        <w:rPr>
+          <w:u w:val="single"/>
+        </w:rPr>
+        <w:t xml:space="preserve"> Outlines the structured pipeline of Intake &amp; Data Capture ~&gt; Policy Verification ~&gt; Fraud Scoring ~&gt; Automated Triage.</w:t>
       </w:r>
     </w:p>
     <w:p>
@@ -665,16 +1050,7 @@
         <w:ind w:left="360"/>
       </w:pPr>
     </w:p>
-    <w:p>
-      <w:pPr>
-        <w:ind w:left="360"/>
-      </w:pPr>
-    </w:p>
     <w:p/>
-    <w:p/>
-    <w:p/>
-    <w:p/>
-    <w:p/>
     <w:p>
       <w:pPr>
         <w:rPr>
@@ -716,24 +1092,11 @@
           <w:color w:val="EE0000"/>
         </w:rPr>
       </w:pPr>
-    </w:p>
-    <w:p>
-      <w:pPr>
+      <w:r>
         <w:rPr>
           <w:color w:val="EE0000"/>
         </w:rPr>
-      </w:pPr>
-    </w:p>
-    <w:p>
-      <w:pPr>
-        <w:rPr>
-          <w:color w:val="EE0000"/>
-        </w:rPr>
-      </w:pPr>
-      <w:r>
-        <w:rPr>
-          <w:color w:val="EE0000"/>
-        </w:rPr>
+        <w:lastRenderedPageBreak/>
         <w:t>2. FinTech / Banking: KYC (Know Your Customer) &amp; Loan Origination</w:t>
       </w:r>
     </w:p>
@@ -798,84 +1161,10 @@
       </w:pPr>
     </w:p>
     <w:p>
-      <w:pPr>
+      <w:r>
         <w:rPr>
           <w:color w:val="EE0000"/>
         </w:rPr>
-      </w:pPr>
-    </w:p>
-    <w:p>
-      <w:pPr>
-        <w:rPr>
-          <w:color w:val="EE0000"/>
-        </w:rPr>
-      </w:pPr>
-    </w:p>
-    <w:p>
-      <w:pPr>
-        <w:rPr>
-          <w:color w:val="EE0000"/>
-        </w:rPr>
-      </w:pPr>
-    </w:p>
-    <w:p>
-      <w:pPr>
-        <w:rPr>
-          <w:color w:val="EE0000"/>
-        </w:rPr>
-      </w:pPr>
-    </w:p>
-    <w:p>
-      <w:pPr>
-        <w:rPr>
-          <w:color w:val="EE0000"/>
-        </w:rPr>
-      </w:pPr>
-    </w:p>
-    <w:p>
-      <w:pPr>
-        <w:rPr>
-          <w:color w:val="EE0000"/>
-        </w:rPr>
-      </w:pPr>
-    </w:p>
-    <w:p>
-      <w:pPr>
-        <w:rPr>
-          <w:color w:val="EE0000"/>
-        </w:rPr>
-      </w:pPr>
-    </w:p>
-    <w:p>
-      <w:pPr>
-        <w:rPr>
-          <w:color w:val="EE0000"/>
-        </w:rPr>
-      </w:pPr>
-    </w:p>
-    <w:p>
-      <w:pPr>
-        <w:rPr>
-          <w:color w:val="EE0000"/>
-        </w:rPr>
-      </w:pPr>
-    </w:p>
-    <w:p>
-      <w:pPr>
-        <w:tabs>
-          <w:tab w:val="left" w:pos="714"/>
-        </w:tabs>
-        <w:rPr>
-          <w:color w:val="EE0000"/>
-        </w:rPr>
-      </w:pPr>
-    </w:p>
-    <w:p>
-      <w:r>
-        <w:rPr>
-          <w:color w:val="EE0000"/>
-        </w:rPr>
-        <w:lastRenderedPageBreak/>
         <w:t>3. Procurement and Accounts Payable (Invoice Processing)</w:t>
       </w:r>
     </w:p>
@@ -999,7 +1288,7 @@
         </w:rPr>
         <w:t xml:space="preserve"> </w:t>
       </w:r>
-      <w:hyperlink r:id="rId7" w:tgtFrame="_blank" w:history="1">
+      <w:hyperlink r:id="rId8" w:tgtFrame="_blank" w:history="1">
         <w:r>
           <w:rPr>
             <w:rStyle w:val="Hyperlink"/>
@@ -1054,6 +1343,7 @@
           <w:bCs/>
           <w:u w:val="single"/>
         </w:rPr>
+        <w:lastRenderedPageBreak/>
         <w:t>Tipalti</w:t>
       </w:r>
       <w:proofErr w:type="spellEnd"/>
@@ -1104,7 +1394,7 @@
         </w:rPr>
         <w:t xml:space="preserve"> </w:t>
       </w:r>
-      <w:hyperlink r:id="rId8" w:tgtFrame="_blank" w:history="1">
+      <w:hyperlink r:id="rId9" w:tgtFrame="_blank" w:history="1">
         <w:r>
           <w:rPr>
             <w:rStyle w:val="Hyperlink"/>
@@ -1462,6 +1752,155 @@
     </w:lvl>
   </w:abstractNum>
   <w:abstractNum w:abstractNumId="2" w15:restartNumberingAfterBreak="0">
+    <w:nsid w:val="0F0315C5"/>
+    <w:multiLevelType w:val="multilevel"/>
+    <w:tmpl w:val="BDA4CE2C"/>
+    <w:lvl w:ilvl="0">
+      <w:start w:val="1"/>
+      <w:numFmt w:val="bullet"/>
+      <w:lvlText w:val=""/>
+      <w:lvlJc w:val="left"/>
+      <w:pPr>
+        <w:tabs>
+          <w:tab w:val="num" w:pos="720"/>
+        </w:tabs>
+        <w:ind w:left="720" w:hanging="360"/>
+      </w:pPr>
+      <w:rPr>
+        <w:rFonts w:ascii="Symbol" w:hAnsi="Symbol" w:hint="default"/>
+        <w:sz w:val="20"/>
+      </w:rPr>
+    </w:lvl>
+    <w:lvl w:ilvl="1">
+      <w:start w:val="1"/>
+      <w:numFmt w:val="bullet"/>
+      <w:lvlText w:val=""/>
+      <w:lvlJc w:val="left"/>
+      <w:pPr>
+        <w:tabs>
+          <w:tab w:val="num" w:pos="1440"/>
+        </w:tabs>
+        <w:ind w:left="1440" w:hanging="360"/>
+      </w:pPr>
+      <w:rPr>
+        <w:rFonts w:ascii="Symbol" w:hAnsi="Symbol" w:hint="default"/>
+        <w:sz w:val="20"/>
+      </w:rPr>
+    </w:lvl>
+    <w:lvl w:ilvl="2" w:tentative="1">
+      <w:start w:val="1"/>
+      <w:numFmt w:val="bullet"/>
+      <w:lvlText w:val=""/>
+      <w:lvlJc w:val="left"/>
+      <w:pPr>
+        <w:tabs>
+          <w:tab w:val="num" w:pos="2160"/>
+        </w:tabs>
+        <w:ind w:left="2160" w:hanging="360"/>
+      </w:pPr>
+      <w:rPr>
+        <w:rFonts w:ascii="Symbol" w:hAnsi="Symbol" w:hint="default"/>
+        <w:sz w:val="20"/>
+      </w:rPr>
+    </w:lvl>
+    <w:lvl w:ilvl="3" w:tentative="1">
+      <w:start w:val="1"/>
+      <w:numFmt w:val="bullet"/>
+      <w:lvlText w:val=""/>
+      <w:lvlJc w:val="left"/>
+      <w:pPr>
+        <w:tabs>
+          <w:tab w:val="num" w:pos="2880"/>
+        </w:tabs>
+        <w:ind w:left="2880" w:hanging="360"/>
+      </w:pPr>
+      <w:rPr>
+        <w:rFonts w:ascii="Symbol" w:hAnsi="Symbol" w:hint="default"/>
+        <w:sz w:val="20"/>
+      </w:rPr>
+    </w:lvl>
+    <w:lvl w:ilvl="4" w:tentative="1">
+      <w:start w:val="1"/>
+      <w:numFmt w:val="bullet"/>
+      <w:lvlText w:val=""/>
+      <w:lvlJc w:val="left"/>
+      <w:pPr>
+        <w:tabs>
+          <w:tab w:val="num" w:pos="3600"/>
+        </w:tabs>
+        <w:ind w:left="3600" w:hanging="360"/>
+      </w:pPr>
+      <w:rPr>
+        <w:rFonts w:ascii="Symbol" w:hAnsi="Symbol" w:hint="default"/>
+        <w:sz w:val="20"/>
+      </w:rPr>
+    </w:lvl>
+    <w:lvl w:ilvl="5" w:tentative="1">
+      <w:start w:val="1"/>
+      <w:numFmt w:val="bullet"/>
+      <w:lvlText w:val=""/>
+      <w:lvlJc w:val="left"/>
+      <w:pPr>
+        <w:tabs>
+          <w:tab w:val="num" w:pos="4320"/>
+        </w:tabs>
+        <w:ind w:left="4320" w:hanging="360"/>
+      </w:pPr>
+      <w:rPr>
+        <w:rFonts w:ascii="Symbol" w:hAnsi="Symbol" w:hint="default"/>
+        <w:sz w:val="20"/>
+      </w:rPr>
+    </w:lvl>
+    <w:lvl w:ilvl="6" w:tentative="1">
+      <w:start w:val="1"/>
+      <w:numFmt w:val="bullet"/>
+      <w:lvlText w:val=""/>
+      <w:lvlJc w:val="left"/>
+      <w:pPr>
+        <w:tabs>
+          <w:tab w:val="num" w:pos="5040"/>
+        </w:tabs>
+        <w:ind w:left="5040" w:hanging="360"/>
+      </w:pPr>
+      <w:rPr>
+        <w:rFonts w:ascii="Symbol" w:hAnsi="Symbol" w:hint="default"/>
+        <w:sz w:val="20"/>
+      </w:rPr>
+    </w:lvl>
+    <w:lvl w:ilvl="7" w:tentative="1">
+      <w:start w:val="1"/>
+      <w:numFmt w:val="bullet"/>
+      <w:lvlText w:val=""/>
+      <w:lvlJc w:val="left"/>
+      <w:pPr>
+        <w:tabs>
+          <w:tab w:val="num" w:pos="5760"/>
+        </w:tabs>
+        <w:ind w:left="5760" w:hanging="360"/>
+      </w:pPr>
+      <w:rPr>
+        <w:rFonts w:ascii="Symbol" w:hAnsi="Symbol" w:hint="default"/>
+        <w:sz w:val="20"/>
+      </w:rPr>
+    </w:lvl>
+    <w:lvl w:ilvl="8" w:tentative="1">
+      <w:start w:val="1"/>
+      <w:numFmt w:val="bullet"/>
+      <w:lvlText w:val=""/>
+      <w:lvlJc w:val="left"/>
+      <w:pPr>
+        <w:tabs>
+          <w:tab w:val="num" w:pos="6480"/>
+        </w:tabs>
+        <w:ind w:left="6480" w:hanging="360"/>
+      </w:pPr>
+      <w:rPr>
+        <w:rFonts w:ascii="Symbol" w:hAnsi="Symbol" w:hint="default"/>
+        <w:sz w:val="20"/>
+      </w:rPr>
+    </w:lvl>
+  </w:abstractNum>
+  <w:abstractNum w:abstractNumId="3" w15:restartNumberingAfterBreak="0">
     <w:nsid w:val="10A833CB"/>
     <w:multiLevelType w:val="multilevel"/>
     <w:tmpl w:val="676CFC28"/>
@@ -1610,7 +2049,120 @@
       </w:rPr>
     </w:lvl>
   </w:abstractNum>
-  <w:abstractNum w:abstractNumId="3" w15:restartNumberingAfterBreak="0">
+  <w:abstractNum w:abstractNumId="4" w15:restartNumberingAfterBreak="0">
+    <w:nsid w:val="1DFD244C"/>
+    <w:multiLevelType w:val="multilevel"/>
+    <w:tmpl w:val="7598CACC"/>
+    <w:lvl w:ilvl="0">
+      <w:start w:val="1"/>
+      <w:numFmt w:val="decimal"/>
+      <w:lvlText w:val="%1."/>
+      <w:lvlJc w:val="left"/>
+      <w:pPr>
+        <w:tabs>
+          <w:tab w:val="num" w:pos="720"/>
+        </w:tabs>
+        <w:ind w:left="720" w:hanging="360"/>
+      </w:pPr>
+    </w:lvl>
+    <w:lvl w:ilvl="1" w:tentative="1">
+      <w:start w:val="1"/>
+      <w:numFmt w:val="decimal"/>
+      <w:lvlText w:val="%2."/>
+      <w:lvlJc w:val="left"/>
+      <w:pPr>
+        <w:tabs>
+          <w:tab w:val="num" w:pos="1440"/>
+        </w:tabs>
+        <w:ind w:left="1440" w:hanging="360"/>
+      </w:pPr>
+    </w:lvl>
+    <w:lvl w:ilvl="2" w:tentative="1">
+      <w:start w:val="1"/>
+      <w:numFmt w:val="decimal"/>
+      <w:lvlText w:val="%3."/>
+      <w:lvlJc w:val="left"/>
+      <w:pPr>
+        <w:tabs>
+          <w:tab w:val="num" w:pos="2160"/>
+        </w:tabs>
+        <w:ind w:left="2160" w:hanging="360"/>
+      </w:pPr>
+    </w:lvl>
+    <w:lvl w:ilvl="3" w:tentative="1">
+      <w:start w:val="1"/>
+      <w:numFmt w:val="decimal"/>
+      <w:lvlText w:val="%4."/>
+      <w:lvlJc w:val="left"/>
+      <w:pPr>
+        <w:tabs>
+          <w:tab w:val="num" w:pos="2880"/>
+        </w:tabs>
+        <w:ind w:left="2880" w:hanging="360"/>
+      </w:pPr>
+    </w:lvl>
+    <w:lvl w:ilvl="4" w:tentative="1">
+      <w:start w:val="1"/>
+      <w:numFmt w:val="decimal"/>
+      <w:lvlText w:val="%5."/>
+      <w:lvlJc w:val="left"/>
+      <w:pPr>
+        <w:tabs>
+          <w:tab w:val="num" w:pos="3600"/>
+        </w:tabs>
+        <w:ind w:left="3600" w:hanging="360"/>
+      </w:pPr>
+    </w:lvl>
+    <w:lvl w:ilvl="5" w:tentative="1">
+      <w:start w:val="1"/>
+      <w:numFmt w:val="decimal"/>
+      <w:lvlText w:val="%6."/>
+      <w:lvlJc w:val="left"/>
+      <w:pPr>
+        <w:tabs>
+          <w:tab w:val="num" w:pos="4320"/>
+        </w:tabs>
+        <w:ind w:left="4320" w:hanging="360"/>
+      </w:pPr>
+    </w:lvl>
+    <w:lvl w:ilvl="6" w:tentative="1">
+      <w:start w:val="1"/>
+      <w:numFmt w:val="decimal"/>
+      <w:lvlText w:val="%7."/>
+      <w:lvlJc w:val="left"/>
+      <w:pPr>
+        <w:tabs>
+          <w:tab w:val="num" w:pos="5040"/>
+        </w:tabs>
+        <w:ind w:left="5040" w:hanging="360"/>
+      </w:pPr>
+    </w:lvl>
+    <w:lvl w:ilvl="7" w:tentative="1">
+      <w:start w:val="1"/>
+      <w:numFmt w:val="decimal"/>
+      <w:lvlText w:val="%8."/>
+      <w:lvlJc w:val="left"/>
+      <w:pPr>
+        <w:tabs>
+          <w:tab w:val="num" w:pos="5760"/>
+        </w:tabs>
+        <w:ind w:left="5760" w:hanging="360"/>
+      </w:pPr>
+    </w:lvl>
+    <w:lvl w:ilvl="8" w:tentative="1">
+      <w:start w:val="1"/>
+      <w:numFmt w:val="decimal"/>
+      <w:lvlText w:val="%9."/>
+      <w:lvlJc w:val="left"/>
+      <w:pPr>
+        <w:tabs>
+          <w:tab w:val="num" w:pos="6480"/>
+        </w:tabs>
+        <w:ind w:left="6480" w:hanging="360"/>
+      </w:pPr>
+    </w:lvl>
+  </w:abstractNum>
+  <w:abstractNum w:abstractNumId="5" w15:restartNumberingAfterBreak="0">
     <w:nsid w:val="269C6FEB"/>
     <w:multiLevelType w:val="multilevel"/>
     <w:tmpl w:val="D082AA52"/>
@@ -1759,7 +2311,7 @@
       </w:rPr>
     </w:lvl>
   </w:abstractNum>
-  <w:abstractNum w:abstractNumId="4" w15:restartNumberingAfterBreak="0">
+  <w:abstractNum w:abstractNumId="6" w15:restartNumberingAfterBreak="0">
     <w:nsid w:val="2AA52BB7"/>
     <w:multiLevelType w:val="multilevel"/>
     <w:tmpl w:val="8504562C"/>
@@ -1908,7 +2460,7 @@
       </w:rPr>
     </w:lvl>
   </w:abstractNum>
-  <w:abstractNum w:abstractNumId="5" w15:restartNumberingAfterBreak="0">
+  <w:abstractNum w:abstractNumId="7" w15:restartNumberingAfterBreak="0">
     <w:nsid w:val="43FC5885"/>
     <w:multiLevelType w:val="multilevel"/>
     <w:tmpl w:val="7630AE72"/>
@@ -2057,7 +2609,7 @@
       </w:rPr>
     </w:lvl>
   </w:abstractNum>
-  <w:abstractNum w:abstractNumId="6" w15:restartNumberingAfterBreak="0">
+  <w:abstractNum w:abstractNumId="8" w15:restartNumberingAfterBreak="0">
     <w:nsid w:val="46EB738C"/>
     <w:multiLevelType w:val="multilevel"/>
     <w:tmpl w:val="20BE866C"/>
@@ -2206,7 +2758,7 @@
       </w:rPr>
     </w:lvl>
   </w:abstractNum>
-  <w:abstractNum w:abstractNumId="7" w15:restartNumberingAfterBreak="0">
+  <w:abstractNum w:abstractNumId="9" w15:restartNumberingAfterBreak="0">
     <w:nsid w:val="470D07A8"/>
     <w:multiLevelType w:val="multilevel"/>
     <w:tmpl w:val="E2C650B0"/>
@@ -2355,7 +2907,7 @@
       </w:rPr>
     </w:lvl>
   </w:abstractNum>
-  <w:abstractNum w:abstractNumId="8" w15:restartNumberingAfterBreak="0">
+  <w:abstractNum w:abstractNumId="10" w15:restartNumberingAfterBreak="0">
     <w:nsid w:val="5ED14F5B"/>
     <w:multiLevelType w:val="multilevel"/>
     <w:tmpl w:val="3AF2AB42"/>
@@ -2504,7 +3056,7 @@
       </w:rPr>
     </w:lvl>
   </w:abstractNum>
-  <w:abstractNum w:abstractNumId="9" w15:restartNumberingAfterBreak="0">
+  <w:abstractNum w:abstractNumId="11" w15:restartNumberingAfterBreak="0">
     <w:nsid w:val="78E35F86"/>
     <w:multiLevelType w:val="multilevel"/>
     <w:tmpl w:val="E57A0C9A"/>
@@ -2654,34 +3206,40 @@
     </w:lvl>
   </w:abstractNum>
   <w:num w:numId="1" w16cid:durableId="1604722821">
-    <w:abstractNumId w:val="3"/>
+    <w:abstractNumId w:val="5"/>
   </w:num>
   <w:num w:numId="2" w16cid:durableId="89547032">
-    <w:abstractNumId w:val="7"/>
+    <w:abstractNumId w:val="9"/>
   </w:num>
   <w:num w:numId="3" w16cid:durableId="1356270081">
     <w:abstractNumId w:val="0"/>
   </w:num>
   <w:num w:numId="4" w16cid:durableId="793838660">
-    <w:abstractNumId w:val="6"/>
+    <w:abstractNumId w:val="8"/>
   </w:num>
   <w:num w:numId="5" w16cid:durableId="1061947826">
-    <w:abstractNumId w:val="8"/>
+    <w:abstractNumId w:val="10"/>
   </w:num>
   <w:num w:numId="6" w16cid:durableId="875696529">
-    <w:abstractNumId w:val="4"/>
+    <w:abstractNumId w:val="6"/>
   </w:num>
   <w:num w:numId="7" w16cid:durableId="1408652351">
     <w:abstractNumId w:val="1"/>
   </w:num>
   <w:num w:numId="8" w16cid:durableId="1645769248">
-    <w:abstractNumId w:val="5"/>
+    <w:abstractNumId w:val="7"/>
   </w:num>
   <w:num w:numId="9" w16cid:durableId="1622884673">
-    <w:abstractNumId w:val="9"/>
+    <w:abstractNumId w:val="11"/>
   </w:num>
   <w:num w:numId="10" w16cid:durableId="186985801">
+    <w:abstractNumId w:val="3"/>
+  </w:num>
+  <w:num w:numId="11" w16cid:durableId="2028750042">
     <w:abstractNumId w:val="2"/>
+  </w:num>
+  <w:num w:numId="12" w16cid:durableId="1506357456">
+    <w:abstractNumId w:val="4"/>
   </w:num>
 </w:numbering>
 </file>
@@ -3636,6 +4194,30 @@
       <w:shd w:val="clear" w:color="auto" w:fill="E1DFDD"/>
     </w:rPr>
   </w:style>
+  <w:style w:type="character" w:styleId="Strong">
+    <w:name w:val="Strong"/>
+    <w:basedOn w:val="DefaultParagraphFont"/>
+    <w:uiPriority w:val="22"/>
+    <w:qFormat/>
+    <w:rsid w:val="000A13E9"/>
+    <w:rPr>
+      <w:b/>
+      <w:bCs/>
+    </w:rPr>
+  </w:style>
+  <w:style w:type="character" w:styleId="HTMLCode">
+    <w:name w:val="HTML Code"/>
+    <w:basedOn w:val="DefaultParagraphFont"/>
+    <w:uiPriority w:val="99"/>
+    <w:semiHidden/>
+    <w:unhideWhenUsed/>
+    <w:rsid w:val="000A13E9"/>
+    <w:rPr>
+      <w:rFonts w:ascii="Courier New" w:eastAsia="Times New Roman" w:hAnsi="Courier New" w:cs="Courier New"/>
+      <w:sz w:val="20"/>
+      <w:szCs w:val="20"/>
+    </w:rPr>
+  </w:style>
 </w:styles>
 </file>
 

</xml_diff>